<commit_message>
Add coverage score and TF-IDF semantic relevance pass; update docs
</commit_message>
<xml_diff>
--- a/docs/Vector-Features.docx
+++ b/docs/Vector-Features.docx
@@ -170,6 +170,32 @@
           <w:szCs w:val="22"/>
         </w:rPr>
         <w:t xml:space="preserve">• Baseline mode - unrecognised prompts still receive baseline AWS controls; never returns an empty result.</w:t>
+      </w:r>
+    </w:p>
+    <w:p>
+      <w:pPr>
+        <w:spacing w:before="0" w:after="60"/>
+        <w:ind w:left="360" w:hanging="360"/>
+      </w:pPr>
+      <w:r>
+        <w:rPr>
+          <w:sz w:val="22"/>
+          <w:szCs w:val="22"/>
+        </w:rPr>
+        <w:t xml:space="preserve">• Prompt Security Coverage Score - the share of required controls the prompt already states, shown before and after hardening.</w:t>
+      </w:r>
+    </w:p>
+    <w:p>
+      <w:pPr>
+        <w:spacing w:before="0" w:after="60"/>
+        <w:ind w:left="360" w:hanging="360"/>
+      </w:pPr>
+      <w:r>
+        <w:rPr>
+          <w:sz w:val="22"/>
+          <w:szCs w:val="22"/>
+        </w:rPr>
+        <w:t xml:space="preserve">• TF-IDF semantic relevance - a classic NLP / information-retrieval pass that reports topically related controls (offline, no model).</w:t>
       </w:r>
     </w:p>
     <w:p>

</xml_diff>

<commit_message>
v0.4.0: paraphrase lexicon, non-AWS guard, disclaimer, UI banner, tests
</commit_message>
<xml_diff>
--- a/docs/Vector-Features.docx
+++ b/docs/Vector-Features.docx
@@ -196,6 +196,45 @@
           <w:szCs w:val="22"/>
         </w:rPr>
         <w:t xml:space="preserve">• TF-IDF semantic relevance - a classic NLP / information-retrieval pass that reports topically related controls (offline, no model).</w:t>
+      </w:r>
+    </w:p>
+    <w:p>
+      <w:pPr>
+        <w:spacing w:before="0" w:after="60"/>
+        <w:ind w:left="360" w:hanging="360"/>
+      </w:pPr>
+      <w:r>
+        <w:rPr>
+          <w:sz w:val="22"/>
+          <w:szCs w:val="22"/>
+        </w:rPr>
+        <w:t xml:space="preserve">• Paraphrase lexicon - a curated, polarity-safe list of alternative phrasings per control (for example "scrambled on disk" -&gt; encryption at rest, "who did what" -&gt; audit logging).</w:t>
+      </w:r>
+    </w:p>
+    <w:p>
+      <w:pPr>
+        <w:spacing w:before="0" w:after="60"/>
+        <w:ind w:left="360" w:hanging="360"/>
+      </w:pPr>
+      <w:r>
+        <w:rPr>
+          <w:sz w:val="22"/>
+          <w:szCs w:val="22"/>
+        </w:rPr>
+        <w:t xml:space="preserve">• Non-AWS guard - warns when a prompt targets Azure or GCP instead of silently applying AWS rules.</w:t>
+      </w:r>
+    </w:p>
+    <w:p>
+      <w:pPr>
+        <w:spacing w:before="0" w:after="60"/>
+        <w:ind w:left="360" w:hanging="360"/>
+      </w:pPr>
+      <w:r>
+        <w:rPr>
+          <w:sz w:val="22"/>
+          <w:szCs w:val="22"/>
+        </w:rPr>
+        <w:t xml:space="preserve">• Advisory disclaimer - results are presented as a diagnostic aid, not a guarantee, and the prompt stays AWS-scoped.</w:t>
       </w:r>
     </w:p>
     <w:p>

</xml_diff>

<commit_message>
Docs: v0.5.1 (one-tap harden, scope guard, start:device); regenerate Word docs
</commit_message>
<xml_diff>
--- a/docs/Vector-Features.docx
+++ b/docs/Vector-Features.docx
@@ -235,6 +235,32 @@
           <w:szCs w:val="22"/>
         </w:rPr>
         <w:t xml:space="preserve">• Advisory disclaimer - results are presented as a diagnostic aid, not a guarantee, and the prompt stays AWS-scoped.</w:t>
+      </w:r>
+    </w:p>
+    <w:p>
+      <w:pPr>
+        <w:spacing w:before="0" w:after="60"/>
+        <w:ind w:left="360" w:hanging="360"/>
+      </w:pPr>
+      <w:r>
+        <w:rPr>
+          <w:sz w:val="22"/>
+          <w:szCs w:val="22"/>
+        </w:rPr>
+        <w:t xml:space="preserve">• One-tap Harden - neutralises risky phrasing and appends missing clauses until the prompt re-analyses to risk 0 / coverage 100%.</w:t>
+      </w:r>
+    </w:p>
+    <w:p>
+      <w:pPr>
+        <w:spacing w:before="0" w:after="60"/>
+        <w:ind w:left="360" w:hanging="360"/>
+      </w:pPr>
+      <w:r>
+        <w:rPr>
+          <w:sz w:val="22"/>
+          <w:szCs w:val="22"/>
+        </w:rPr>
+        <w:t xml:space="preserve">• Scope guard - input with no infrastructure signal is rejected instead of being scored.</w:t>
       </w:r>
     </w:p>
     <w:p>

</xml_diff>